<commit_message>
Corregir seccion 1.2.1: conservar parrafo estandar de plantilla mas lista Ferramas.
Co-authored-by: Cursor <cursoragent@cursor.com>
</commit_message>
<xml_diff>
--- a/docs/Plan_de_Pruebas_Ferramas.docx
+++ b/docs/Plan_de_Pruebas_Ferramas.docx
@@ -5305,9 +5305,17 @@
       </w:pPr>
       <w:r>
         <w:rPr>
-          <w:lang w:val="es-CL"/>
+          <w:color w:val="000000"/>
         </w:rPr>
         <w:t>Listado de todos los módulos, componentes o elementos que se van a probar. Si es de alto nivel, se listan las áreas funcionales (módulos o procesos que cubre el Testing), por otro lado, si es de un nivel detallado se listan los programas, unidades o módulos.</w:t>
+      </w:r>
+    </w:p>
+    <w:p>
+      <w:r>
+        <w:rPr>
+          <w:color w:val="000000"/>
+        </w:rPr>
+        <w:t>Elementos de Ferramas (nivel detallado): (1) API REST — app/api/producto_api.py (/api/productos, /api/categorias, /api/divisas, webhook Mercado Pago); (2) Vistas web — app/views/tienda.py, carrito.py, auth.py, admin, vendedor, bodeguero; (3) Servicios — AuthService, DivisaService, PagoService; (4) Modelos ORM — Producto, Usuario, Carrito, Pedido; (5) Suite de pruebas — carpeta tests/ (30 casos: unitarios, integración, mock, aceptación, carga y estrés).</w:t>
       </w:r>
     </w:p>
     <w:p>

</xml_diff>